<commit_message>
Generalize operational details in public ACL analysis
</commit_message>
<xml_diff>
--- a/cases/acl/analysis/ACL - Análise.docx
+++ b/cases/acl/analysis/ACL - Análise.docx
@@ -118,81 +118,49 @@
           <w:color w:val="1f1f1f"/>
           <w:rtl w:val="0"/>
         </w:rPr>
-        <w:t xml:space="preserve">Através do painel de administrador do site foi possível ver que ACL ainda usa a versão php 7.4.33, que já foi descontinuada há alguns anos. Neste momento, a versão mais recente é a 8.x que apresenta ganhos consideráveis a nível de performance. Alguns benchmarks analisados dizem que tem um ganho de entre 20% e 40% de execução, e até 17% lower memory usage. Esta deve ser uma das razões principais de o site estar muito lento. Além disso, uma vez que esta versão do php já não recebe atualizações de segurança, o site pode estar vulnerável.</w:t>
-      </w:r>
-    </w:p>
-    <w:p>
-      <w:pPr>
-        <w:ind w:left="0" w:firstLine="0"/>
-        <w:jc w:val="both"/>
-        <w:rPr>
-          <w:color w:val="1f1f1f"/>
-        </w:rPr>
-      </w:pPr>
-      <w:r>
-        <w:rPr>
-          <w:rtl w:val="0"/>
-        </w:rPr>
-      </w:r>
-    </w:p>
-    <w:p>
-      <w:pPr>
-        <w:jc w:val="both"/>
-        <w:rPr>
-          <w:color w:val="1f1f1f"/>
-        </w:rPr>
-      </w:pPr>
-      <w:r>
-        <w:rPr>
-          <w:color w:val="1f1f1f"/>
-          <w:rtl w:val="0"/>
-        </w:rPr>
-        <w:t xml:space="preserve">“No wordpress: WordPress 6.x requests/sec- PHP 7.4 ( 85 ) , PHP 8.3 118 (+39%).“ </w:t>
-      </w:r>
-      <w:hyperlink r:id="rId6">
-        <w:r>
-          <w:rPr>
-            <w:color w:val="1155cc"/>
-            <w:u w:val="single"/>
-            <w:rtl w:val="0"/>
-          </w:rPr>
-          <w:t xml:space="preserve">https://massivegrid.com/blog/php-8-performance-hosting-upgrade/</w:t>
-        </w:r>
-      </w:hyperlink>
-      <w:r>
-        <w:rPr>
-          <w:color w:val="1f1f1f"/>
-          <w:rtl w:val="0"/>
-        </w:rPr>
-        <w:t xml:space="preserve"> </w:t>
-      </w:r>
-    </w:p>
-    <w:p>
-      <w:pPr>
-        <w:jc w:val="both"/>
-        <w:rPr>
-          <w:color w:val="1f1f1f"/>
-        </w:rPr>
-      </w:pPr>
-      <w:r>
-        <w:rPr>
-          <w:rtl w:val="0"/>
-        </w:rPr>
-      </w:r>
-    </w:p>
-    <w:p>
-      <w:pPr>
-        <w:jc w:val="both"/>
-        <w:rPr>
-          <w:color w:val="1f1f1f"/>
-        </w:rPr>
-      </w:pPr>
-      <w:r>
-        <w:rPr>
-          <w:color w:val="1f1f1f"/>
-          <w:rtl w:val="0"/>
-        </w:rPr>
-        <w:t xml:space="preserve">Dos 27 plugins ativos, 21 estão desatualizados.</w:t>
+        <w:t>A análise do painel de administração identificou necessidades de atualização dos componentes técnicos do site. A manutenção destas componentes deve ser acompanhada pela equipa responsável pela infraestrutura.</w:t>
+      </w:r>
+    </w:p>
+    <w:p>
+      <w:pPr>
+        <w:ind w:left="0" w:firstLine="0"/>
+        <w:jc w:val="both"/>
+        <w:rPr>
+          <w:color w:val="1f1f1f"/>
+        </w:rPr>
+      </w:pPr>
+      <w:r>
+        <w:rPr>
+          <w:rtl w:val="0"/>
+        </w:rPr>
+      </w:r>
+    </w:p>
+    <w:p>
+      <w:pPr>
+        <w:jc w:val="both"/>
+        <w:rPr>
+          <w:color w:val="1f1f1f"/>
+        </w:rPr>
+      </w:pPr>
+      <w:r>
+        <w:rPr>
+          <w:rtl w:val="0"/>
+        </w:rPr>
+      </w:r>
+    </w:p>
+    <w:p>
+      <w:pPr>
+        <w:jc w:val="both"/>
+        <w:rPr>
+          <w:color w:val="1f1f1f"/>
+        </w:rPr>
+      </w:pPr>
+      <w:r>
+        <w:rPr>
+          <w:color w:val="1f1f1f"/>
+          <w:rtl w:val="0"/>
+        </w:rPr>
+        <w:t>A análise identificou também necessidades de atualização dos plugins. Os detalhes operacionais foram omitidos nesta versão pública.</w:t>
       </w:r>
     </w:p>
     <w:p>
@@ -218,7 +186,7 @@
           <w:color w:val="1f1f1f"/>
           <w:rtl w:val="0"/>
         </w:rPr>
-        <w:t xml:space="preserve">O sistema de backups é assegurado pelo plugin All-in-One WP Migration, com a última atualização registada a 5 de maio de 2025. </w:t>
+        <w:t>O site dispõe de um mecanismo de cópias de segurança. A configuração e a manutenção deste mecanismo devem ser acompanhadas pela equipa responsável.</w:t>
       </w:r>
       <w:r>
         <w:rPr>

</xml_diff>